<commit_message>
Document demo accounts and fix Gemini web launcher
</commit_message>
<xml_diff>
--- a/output/report/Bao_cao_do_an_HHL_Stay.docx
+++ b/output/report/Bao_cao_do_an_HHL_Stay.docx
@@ -117,6 +117,293 @@
     </w:p>
     <w:p>
       <w:pPr>
+        <w:spacing w:after="360"/>
+        <w:jc w:val="center"/>
+      </w:pPr>
+      <w:r>
+        <w:rPr>
+          <w:rFonts w:ascii="Times New Roman" w:hAnsi="Times New Roman"/>
+          <w:b/>
+          <w:sz w:val="28"/>
+        </w:rPr>
+        <w:t>DANH SÁCH VÀ NHIỆM VỤ CÁC THÀNH VIÊN TRONG NHÓM</w:t>
+      </w:r>
+    </w:p>
+    <w:tbl>
+      <w:tblPr>
+        <w:tblStyle w:val="TableGrid"/>
+        <w:tblW w:type="auto" w:w="0"/>
+        <w:jc w:val="center"/>
+        <w:tblLook w:firstColumn="1" w:firstRow="1" w:lastColumn="0" w:lastRow="0" w:noHBand="0" w:noVBand="1" w:val="04A0"/>
+      </w:tblPr>
+      <w:tblGrid>
+        <w:gridCol w:w="3120"/>
+        <w:gridCol w:w="3120"/>
+        <w:gridCol w:w="3120"/>
+      </w:tblGrid>
+      <w:tr>
+        <w:tc>
+          <w:tcPr>
+            <w:tcW w:type="dxa" w:w="2324"/>
+            <w:vAlign w:val="center"/>
+          </w:tcPr>
+          <w:p>
+            <w:pPr>
+              <w:spacing w:after="80" w:before="80"/>
+            </w:pPr>
+            <w:r>
+              <w:rPr>
+                <w:rFonts w:ascii="Times New Roman" w:hAnsi="Times New Roman"/>
+                <w:b/>
+                <w:sz w:val="21"/>
+              </w:rPr>
+              <w:t>Họ tên / Mã sinh viên</w:t>
+            </w:r>
+          </w:p>
+        </w:tc>
+        <w:tc>
+          <w:tcPr>
+            <w:tcW w:type="dxa" w:w="5102"/>
+            <w:vAlign w:val="center"/>
+          </w:tcPr>
+          <w:p>
+            <w:pPr>
+              <w:spacing w:after="80" w:before="80"/>
+            </w:pPr>
+            <w:r>
+              <w:rPr>
+                <w:rFonts w:ascii="Times New Roman" w:hAnsi="Times New Roman"/>
+                <w:b/>
+                <w:sz w:val="21"/>
+              </w:rPr>
+              <w:t>Nhiệm vụ ghi nhận trong sản phẩm</w:t>
+            </w:r>
+          </w:p>
+        </w:tc>
+        <w:tc>
+          <w:tcPr>
+            <w:tcW w:type="dxa" w:w="1814"/>
+            <w:vAlign w:val="center"/>
+          </w:tcPr>
+          <w:p>
+            <w:pPr>
+              <w:spacing w:after="80" w:before="80"/>
+            </w:pPr>
+            <w:r>
+              <w:rPr>
+                <w:rFonts w:ascii="Times New Roman" w:hAnsi="Times New Roman"/>
+                <w:b/>
+                <w:sz w:val="21"/>
+              </w:rPr>
+              <w:t>Tỷ lệ đóng góp</w:t>
+            </w:r>
+          </w:p>
+        </w:tc>
+      </w:tr>
+      <w:tr>
+        <w:tc>
+          <w:tcPr>
+            <w:tcW w:type="dxa" w:w="2324"/>
+            <w:vAlign w:val="center"/>
+          </w:tcPr>
+          <w:p>
+            <w:pPr>
+              <w:spacing w:after="80" w:before="80"/>
+            </w:pPr>
+            <w:r>
+              <w:rPr>
+                <w:rFonts w:ascii="Times New Roman" w:hAnsi="Times New Roman"/>
+                <w:b w:val="0"/>
+                <w:sz w:val="21"/>
+              </w:rPr>
+              <w:t>Phạm Văn Huấn</w:t>
+              <w:br/>
+              <w:t>23010331</w:t>
+            </w:r>
+          </w:p>
+        </w:tc>
+        <w:tc>
+          <w:tcPr>
+            <w:tcW w:type="dxa" w:w="5102"/>
+            <w:vAlign w:val="center"/>
+          </w:tcPr>
+          <w:p>
+            <w:pPr>
+              <w:spacing w:after="80" w:before="80"/>
+            </w:pPr>
+            <w:r>
+              <w:rPr>
+                <w:rFonts w:ascii="Times New Roman" w:hAnsi="Times New Roman"/>
+                <w:b w:val="0"/>
+                <w:sz w:val="21"/>
+              </w:rPr>
+              <w:t>Cập nhật README và tài liệu hướng dẫn dự án.</w:t>
+            </w:r>
+          </w:p>
+        </w:tc>
+        <w:tc>
+          <w:tcPr>
+            <w:tcW w:type="dxa" w:w="1814"/>
+            <w:vAlign w:val="center"/>
+          </w:tcPr>
+          <w:p>
+            <w:pPr>
+              <w:spacing w:after="80" w:before="80"/>
+            </w:pPr>
+            <w:r>
+              <w:rPr>
+                <w:rFonts w:ascii="Times New Roman" w:hAnsi="Times New Roman"/>
+                <w:b w:val="0"/>
+                <w:sz w:val="21"/>
+              </w:rPr>
+              <w:t>Nhóm xác nhận</w:t>
+            </w:r>
+          </w:p>
+        </w:tc>
+      </w:tr>
+      <w:tr>
+        <w:tc>
+          <w:tcPr>
+            <w:tcW w:type="dxa" w:w="2324"/>
+            <w:vAlign w:val="center"/>
+          </w:tcPr>
+          <w:p>
+            <w:pPr>
+              <w:spacing w:after="80" w:before="80"/>
+            </w:pPr>
+            <w:r>
+              <w:rPr>
+                <w:rFonts w:ascii="Times New Roman" w:hAnsi="Times New Roman"/>
+                <w:b w:val="0"/>
+                <w:sz w:val="21"/>
+              </w:rPr>
+              <w:t>Nguyễn Hữu Lê Hiếu</w:t>
+              <w:br/>
+              <w:t>23010985</w:t>
+            </w:r>
+          </w:p>
+        </w:tc>
+        <w:tc>
+          <w:tcPr>
+            <w:tcW w:type="dxa" w:w="5102"/>
+            <w:vAlign w:val="center"/>
+          </w:tcPr>
+          <w:p>
+            <w:pPr>
+              <w:spacing w:after="80" w:before="80"/>
+            </w:pPr>
+            <w:r>
+              <w:rPr>
+                <w:rFonts w:ascii="Times New Roman" w:hAnsi="Times New Roman"/>
+                <w:b w:val="0"/>
+                <w:sz w:val="21"/>
+              </w:rPr>
+              <w:t>Phát triển ứng dụng, luồng khách và quản trị, lưu trữ demo, AI, kiểm thử và báo cáo.</w:t>
+            </w:r>
+          </w:p>
+        </w:tc>
+        <w:tc>
+          <w:tcPr>
+            <w:tcW w:type="dxa" w:w="1814"/>
+            <w:vAlign w:val="center"/>
+          </w:tcPr>
+          <w:p>
+            <w:pPr>
+              <w:spacing w:after="80" w:before="80"/>
+            </w:pPr>
+            <w:r>
+              <w:rPr>
+                <w:rFonts w:ascii="Times New Roman" w:hAnsi="Times New Roman"/>
+                <w:b w:val="0"/>
+                <w:sz w:val="21"/>
+              </w:rPr>
+              <w:t>Nhóm xác nhận</w:t>
+            </w:r>
+          </w:p>
+        </w:tc>
+      </w:tr>
+      <w:tr>
+        <w:tc>
+          <w:tcPr>
+            <w:tcW w:type="dxa" w:w="2324"/>
+            <w:vAlign w:val="center"/>
+          </w:tcPr>
+          <w:p>
+            <w:pPr>
+              <w:spacing w:after="80" w:before="80"/>
+            </w:pPr>
+            <w:r>
+              <w:rPr>
+                <w:rFonts w:ascii="Times New Roman" w:hAnsi="Times New Roman"/>
+                <w:b w:val="0"/>
+                <w:sz w:val="21"/>
+              </w:rPr>
+              <w:t>Nguyễn Hải Long</w:t>
+              <w:br/>
+              <w:t>2301872</w:t>
+            </w:r>
+          </w:p>
+        </w:tc>
+        <w:tc>
+          <w:tcPr>
+            <w:tcW w:type="dxa" w:w="5102"/>
+            <w:vAlign w:val="center"/>
+          </w:tcPr>
+          <w:p>
+            <w:pPr>
+              <w:spacing w:after="80" w:before="80"/>
+            </w:pPr>
+            <w:r>
+              <w:rPr>
+                <w:rFonts w:ascii="Times New Roman" w:hAnsi="Times New Roman"/>
+                <w:b w:val="0"/>
+                <w:sz w:val="21"/>
+              </w:rPr>
+              <w:t>Khởi tạo và đưa project lên repository, phối hợp tích hợp mã nguồn.</w:t>
+            </w:r>
+          </w:p>
+        </w:tc>
+        <w:tc>
+          <w:tcPr>
+            <w:tcW w:type="dxa" w:w="1814"/>
+            <w:vAlign w:val="center"/>
+          </w:tcPr>
+          <w:p>
+            <w:pPr>
+              <w:spacing w:after="80" w:before="80"/>
+            </w:pPr>
+            <w:r>
+              <w:rPr>
+                <w:rFonts w:ascii="Times New Roman" w:hAnsi="Times New Roman"/>
+                <w:b w:val="0"/>
+                <w:sz w:val="21"/>
+              </w:rPr>
+              <w:t>Nhóm xác nhận</w:t>
+            </w:r>
+          </w:p>
+        </w:tc>
+      </w:tr>
+    </w:tbl>
+    <w:p>
+      <w:pPr>
+        <w:spacing w:before="280"/>
+        <w:jc w:val="both"/>
+      </w:pPr>
+      <w:r>
+        <w:rPr>
+          <w:rFonts w:ascii="Times New Roman" w:hAnsi="Times New Roman"/>
+          <w:sz w:val="20"/>
+        </w:rPr>
+        <w:t>Nhiệm vụ trên được tổng hợp từ nội dung repository. Tỷ lệ đóng góp cần được cả nhóm xác nhận theo công việc thực tế trước khi nộp.</w:t>
+      </w:r>
+    </w:p>
+    <w:p>
+      <w:r>
+        <w:br w:type="page"/>
+      </w:r>
+    </w:p>
+    <w:p>
+      <w:pPr>
         <w:keepNext/>
         <w:spacing w:before="80" w:after="100"/>
         <w:jc w:val="left"/>
@@ -242,7 +529,7 @@
         <w:jc w:val="both"/>
       </w:pPr>
       <w:r>
-        <w:t>Báo cáo gồm sáu chương và bảy phụ lục. Số trang đã đối chiếu bản Word xuất PDF cuối, tính theo trang in. Các ảnh ghi lại giao diện app local; sơ đồ mô tả luồng hiện có và chỉ rõ giới hạn prototype.</w:t>
+        <w:t>Báo cáo gồm sáu chương và bảy phụ lục. Số trang được đối chiếu bản Word xuất PDF cuối, tính theo trang in. Các ảnh ghi lại giao diện app local; sơ đồ mô tả luồng hiện có và chỉ rõ giới hạn prototype.</w:t>
       </w:r>
     </w:p>
     <w:p>
@@ -256,7 +543,7 @@
       <w:r>
         <w:t>Chương 1: Mở đầu</w:t>
         <w:tab/>
-        <w:t>6</w:t>
+        <w:t>7</w:t>
       </w:r>
     </w:p>
     <w:p>
@@ -270,7 +557,7 @@
       <w:r>
         <w:t>Chương 2: Cơ sở lý thuyết</w:t>
         <w:tab/>
-        <w:t>10</w:t>
+        <w:t>11</w:t>
       </w:r>
     </w:p>
     <w:p>
@@ -284,7 +571,7 @@
       <w:r>
         <w:t>Chương 3: Phân tích và thiết kế</w:t>
         <w:tab/>
-        <w:t>15</w:t>
+        <w:t>16</w:t>
       </w:r>
     </w:p>
     <w:p>
@@ -298,7 +585,7 @@
       <w:r>
         <w:t>Chương 4: Triển khai</w:t>
         <w:tab/>
-        <w:t>24</w:t>
+        <w:t>25</w:t>
       </w:r>
     </w:p>
     <w:p>
@@ -312,7 +599,7 @@
       <w:r>
         <w:t>Chương 5: Kiểm thử và đánh giá</w:t>
         <w:tab/>
-        <w:t>31</w:t>
+        <w:t>32</w:t>
       </w:r>
     </w:p>
     <w:p>
@@ -326,7 +613,7 @@
       <w:r>
         <w:t>Chương 6: Kết luận</w:t>
         <w:tab/>
-        <w:t>37</w:t>
+        <w:t>38</w:t>
       </w:r>
     </w:p>
     <w:p>
@@ -340,7 +627,7 @@
       <w:r>
         <w:t>Tài liệu tham khảo</w:t>
         <w:tab/>
-        <w:t>40</w:t>
+        <w:t>41</w:t>
       </w:r>
     </w:p>
     <w:p>
@@ -354,7 +641,7 @@
       <w:r>
         <w:t>Phụ lục A: Hướng dẫn chạy</w:t>
         <w:tab/>
-        <w:t>41</w:t>
+        <w:t>42</w:t>
       </w:r>
     </w:p>
     <w:p>
@@ -368,7 +655,7 @@
       <w:r>
         <w:t>Phụ lục B: Kết quả kiểm thử</w:t>
         <w:tab/>
-        <w:t>42</w:t>
+        <w:t>43</w:t>
       </w:r>
     </w:p>
     <w:p>
@@ -382,7 +669,7 @@
       <w:r>
         <w:t>Phụ lục C: Đối chiếu yêu cầu</w:t>
         <w:tab/>
-        <w:t>43</w:t>
+        <w:t>44</w:t>
       </w:r>
     </w:p>
     <w:p>
@@ -396,7 +683,7 @@
       <w:r>
         <w:t>Phụ lục D: Thuật ngữ</w:t>
         <w:tab/>
-        <w:t>44</w:t>
+        <w:t>45</w:t>
       </w:r>
     </w:p>
     <w:p>
@@ -410,7 +697,7 @@
       <w:r>
         <w:t>Phụ lục E: Sơ đồ UML bổ sung</w:t>
         <w:tab/>
-        <w:t>44–46</w:t>
+        <w:t>45–47</w:t>
       </w:r>
     </w:p>
     <w:p>
@@ -424,7 +711,7 @@
       <w:r>
         <w:t>Phụ lục F: Bảng phân tích chi tiết</w:t>
         <w:tab/>
-        <w:t>47–55</w:t>
+        <w:t>48–56</w:t>
       </w:r>
     </w:p>
     <w:p>
@@ -438,7 +725,7 @@
       <w:r>
         <w:t>Phụ lục G: Ảnh chụp giao diện</w:t>
         <w:tab/>
-        <w:t>56–62</w:t>
+        <w:t>57–63</w:t>
       </w:r>
     </w:p>
     <w:p>
@@ -462,7 +749,7 @@
         <w:jc w:val="both"/>
       </w:pPr>
       <w:r>
-        <w:t>Các hình UML được xây dựng theo nghiệp vụ và đối chiếu với model/repository hiện có. Báo cáo có một Class Diagram, một Use Case Diagram, ba Activity Diagram và năm Sequence Diagram. Bảng chi tiết ở Phụ lục F.</w:t>
+        <w:t>Các hình UML được xây dựng theo nghiệp vụ và đối chiếu với model/repository hiện có. Báo cáo có một Class Diagram, một Use Case Diagram, ba Activity Diagram, bốn Sequence Diagram và một sơ đồ vòng đời booking. Bảng chi tiết ở Phụ lục F.</w:t>
       </w:r>
     </w:p>
     <w:p>
@@ -476,7 +763,7 @@
       <w:r>
         <w:t>Hình 3.1 Sơ đồ lớp dữ liệu HHL Stay</w:t>
         <w:tab/>
-        <w:t>20</w:t>
+        <w:t>21</w:t>
       </w:r>
     </w:p>
     <w:p>
@@ -490,7 +777,7 @@
       <w:r>
         <w:t>Hình 3.2 Use Case theo tác nhân</w:t>
         <w:tab/>
-        <w:t>20</w:t>
+        <w:t>21</w:t>
       </w:r>
     </w:p>
     <w:p>
@@ -504,7 +791,7 @@
       <w:r>
         <w:t>Hình 3.3 Activity gửi yêu cầu đặt phòng</w:t>
         <w:tab/>
-        <w:t>21</w:t>
+        <w:t>22</w:t>
       </w:r>
     </w:p>
     <w:p>
@@ -518,7 +805,7 @@
       <w:r>
         <w:t>Hình 3.4 Sequence tạo booking</w:t>
         <w:tab/>
-        <w:t>21</w:t>
+        <w:t>22</w:t>
       </w:r>
     </w:p>
     <w:p>
@@ -532,7 +819,7 @@
       <w:r>
         <w:t>Hình 3.5 Vòng đời booking</w:t>
         <w:tab/>
-        <w:t>22</w:t>
+        <w:t>23</w:t>
       </w:r>
     </w:p>
     <w:p>
@@ -546,7 +833,7 @@
       <w:r>
         <w:t>Hình 3.6 Activity tìm kiếm và lọc</w:t>
         <w:tab/>
-        <w:t>44</w:t>
+        <w:t>45</w:t>
       </w:r>
     </w:p>
     <w:p>
@@ -574,7 +861,7 @@
       <w:r>
         <w:t>Hình 3.8 Sequence duyệt booking</w:t>
         <w:tab/>
-        <w:t>45</w:t>
+        <w:t>46</w:t>
       </w:r>
     </w:p>
     <w:p>
@@ -602,7 +889,7 @@
       <w:r>
         <w:t>Hình 3.10 Sequence tổng hợp tài chính</w:t>
         <w:tab/>
-        <w:t>46</w:t>
+        <w:t>47</w:t>
       </w:r>
     </w:p>
     <w:p>
@@ -614,9 +901,9 @@
         <w:ind w:left="85"/>
       </w:pPr>
       <w:r>
-        <w:t>Bảng F.1 User Stories và tiêu chí chấp nhận</w:t>
+        <w:t>Hình C.1 Flow of Work của nhóm</w:t>
         <w:tab/>
-        <w:t>47</w:t>
+        <w:t>44</w:t>
       </w:r>
     </w:p>
     <w:p>
@@ -628,7 +915,7 @@
         <w:ind w:left="85"/>
       </w:pPr>
       <w:r>
-        <w:t>Bảng F.2 Ma trận yêu cầu chức năng</w:t>
+        <w:t>Bảng F.1 User Stories và tiêu chí chấp nhận</w:t>
         <w:tab/>
         <w:t>48</w:t>
       </w:r>
@@ -642,7 +929,7 @@
         <w:ind w:left="85"/>
       </w:pPr>
       <w:r>
-        <w:t>Bảng F.3 Tác nhân, quyền và quan hệ</w:t>
+        <w:t>Bảng F.2 Ma trận yêu cầu chức năng</w:t>
         <w:tab/>
         <w:t>49</w:t>
       </w:r>
@@ -656,7 +943,7 @@
         <w:ind w:left="85"/>
       </w:pPr>
       <w:r>
-        <w:t>Bảng F.4 Từ điển dữ liệu</w:t>
+        <w:t>Bảng F.3 Tác nhân, quyền và quan hệ</w:t>
         <w:tab/>
         <w:t>50</w:t>
       </w:r>
@@ -670,7 +957,7 @@
         <w:ind w:left="85"/>
       </w:pPr>
       <w:r>
-        <w:t>Bảng F.5 Trạng thái booking và ngày ở</w:t>
+        <w:t>Bảng F.4 Từ điển dữ liệu</w:t>
         <w:tab/>
         <w:t>51</w:t>
       </w:r>
@@ -684,7 +971,7 @@
         <w:ind w:left="85"/>
       </w:pPr>
       <w:r>
-        <w:t>Bảng F.6 Công thức tài chính</w:t>
+        <w:t>Bảng F.5 Trạng thái booking và ngày ở</w:t>
         <w:tab/>
         <w:t>52</w:t>
       </w:r>
@@ -698,7 +985,7 @@
         <w:ind w:left="85"/>
       </w:pPr>
       <w:r>
-        <w:t>Bảng F.7 Ma trận kiểm thử hồi quy</w:t>
+        <w:t>Bảng F.6 Công thức tài chính</w:t>
         <w:tab/>
         <w:t>53</w:t>
       </w:r>
@@ -712,7 +999,7 @@
         <w:ind w:left="85"/>
       </w:pPr>
       <w:r>
-        <w:t>Bảng F.8 Quy trình thao tác demo</w:t>
+        <w:t>Bảng F.7 Ma trận kiểm thử hồi quy</w:t>
         <w:tab/>
         <w:t>54</w:t>
       </w:r>
@@ -726,9 +1013,23 @@
         <w:ind w:left="85"/>
       </w:pPr>
       <w:r>
+        <w:t>Bảng F.8 Quy trình thao tác demo</w:t>
+        <w:tab/>
+        <w:t>55</w:t>
+      </w:r>
+    </w:p>
+    <w:p>
+      <w:pPr>
+        <w:tabs>
+          <w:tab w:pos="8844" w:val="right" w:leader="dot"/>
+        </w:tabs>
+        <w:spacing w:after="40"/>
+        <w:ind w:left="85"/>
+      </w:pPr>
+      <w:r>
         <w:t>Bảng F.9 Giới hạn và rủi ro</w:t>
         <w:tab/>
-        <w:t>55</w:t>
+        <w:t>56</w:t>
       </w:r>
     </w:p>
     <w:p>
@@ -2006,7 +2307,7 @@
         <w:jc w:val="both"/>
       </w:pPr>
       <w:r>
-        <w:t>Router nối Home/Explore, chi tiết, booking, tài khoản và host. Các trang yêu cầu phiên demo chuyển người chưa xác thực về login. Ảnh browser hiện tại phản ánh đúng redirect.</w:t>
+        <w:t>Router nối landing/Home/Explore, chi tiết, booking, tài khoản và host. Duyệt danh mục công khai; gửi booking và mở trang tài khoản/quản trị yêu cầu phiên demo phù hợp vai trò. Bộ ảnh Phụ lục G ghi lại cả luồng khách lẫn các màn quản trị sau khi mở đúng phân hệ.</w:t>
       </w:r>
     </w:p>
     <w:p>
@@ -2637,7 +2938,7 @@
         <w:jc w:val="both"/>
       </w:pPr>
       <w:r>
-        <w:t>Test kiểm tra admin navigation, thống kê demo, thêm homestay/phòng, duyệt đơn, lịch, bảo trì. Browser route admin hiện chuyển login; phiên này chưa xác minh dashboard sau đăng nhập thực.</w:t>
+        <w:t>Widget tests kiểm tra điều hướng quản trị, chỉ số dashboard, thêm homestay, duyệt booking, lịch và thao tác vận hành. Bộ ảnh Phụ lục G ghi nhận trang tổng quan quản trị, tài chính, lịch phòng và buồng phòng đang chạy trên localhost. Số liệu và thay đổi ở đây là dữ liệu demo lưu cục bộ; không đại diện giao dịch giữa nhiều người dùng.</w:t>
       </w:r>
     </w:p>
     <w:p>
@@ -2690,7 +2991,7 @@
         <w:jc w:val="both"/>
       </w:pPr>
       <w:r>
-        <w:t>Widget test có ca 320px và luồng Explore/booking/admin. Ảnh phụ lục là browser screenshot. Explore/Detail còn placeholder; booking/profile/admin redirect login khi chưa có phiên.</w:t>
+        <w:t>Widget tests có ca bố cục hẹp 320px cho hồ sơ, lịch phòng và thao tác phòng. Ảnh Phụ lục G được chụp từ app chạy tại localhost ở 1280 × 720, bao gồm Home, Explore, chi tiết, booking, lịch sử, yêu thích, xác thực, hồ sơ, dashboard, tài chính, lịch, buồng phòng và trợ lý. Bộ ảnh chứng minh các màn hình đã được dựng; khả năng truy cập máy chủ, hiệu năng trên thiết bị và mọi trạng thái lỗi cần kiểm thử riêng.</w:t>
       </w:r>
     </w:p>
     <w:p>
@@ -2772,7 +3073,7 @@
         <w:jc w:val="both"/>
       </w:pPr>
       <w:r>
-        <w:t>Dữ liệu lưu trên trình duyệt không đáp ứng giao dịch thật hoặc đồng bộ nhiều thiết bị; AI online phụ thuộc API key, quyền project và quota; một số route host trong bộ ảnh minh chứng đang chuyển về đăng nhập do phiên demo chưa được khởi tạo trong lần chụp. Các giới hạn này được ghi rõ để không nhầm prototype với dịch vụ đã vận hành.</w:t>
+        <w:t>Dữ liệu lưu trên trình duyệt không đồng bộ nhiều thiết bị và không bảo đảm giao dịch thật; AI online phụ thuộc API key, quyền project, mạng và hạn mức. Quản trị local giúp trình diễn luồng, nhưng không thay thế xác thực hay phân quyền phía máy chủ. Các giới hạn này được ghi rõ để không nhầm prototype với dịch vụ đã vận hành.</w:t>
       </w:r>
     </w:p>
     <w:p>
@@ -2796,7 +3097,7 @@
         <w:jc w:val="both"/>
       </w:pPr>
       <w:r>
-        <w:t>Báo cáo đáp ứng cấu phần nhìn thấy trên bảng: User Stories, phân tích actor/yêu cầu/quan hệ, một Class Diagram, hơn bốn sơ đồ Sequence/Activity và ảnh app. Nếu cô yêu cầu file Figma riêng, nhóm cần bổ sung link/file đó.</w:t>
+        <w:t>Báo cáo đối chiếu từng nội dung đọc được trên bảng: User Stories; phân tích tác nhân, quan hệ và nghiệp vụ; một Class Diagram; bảy sơ đồ Activity/Sequence (ba Activity, bốn Sequence); thiết kế màn hình bằng ảnh app và Flow of Work. Chưa có file Figma riêng trong repository; nếu giảng viên yêu cầu bản Figma có thể chỉnh sửa, nhóm cần bổ sung file/link riêng.</w:t>
       </w:r>
     </w:p>
     <w:p>
@@ -2902,7 +3203,7 @@
         <w:jc w:val="both"/>
       </w:pPr>
       <w:r>
-        <w:t>Xác minh đúng port/build, sửa asset path, thử luồng khách trên browser profile sạch, kiểm tra admin sau login demo và ghi console/network. Nhãn demo cần rõ ràng; không dùng dữ liệu cá nhân.</w:t>
+        <w:t>Giữ nhãn dữ liệu mẫu rõ ràng; tiếp tục thử luồng trên profile trình duyệt sạch và lưu ảnh minh chứng có ngày chụp. Trước buổi bảo vệ, nhập đúng tên giảng viên và thống nhất tỷ lệ đóng góp thực tế của từng thành viên. Không đưa khóa API hoặc dữ liệu cá nhân vào báo cáo.</w:t>
       </w:r>
     </w:p>
     <w:p>
@@ -3395,7 +3696,16 @@
         <w:ind w:left="397"/>
       </w:pPr>
       <w:r>
-        <w:t>Sequence/Activity: Hình 3.3–3.10, tổng cộng 7 sơ đồ quy trình</w:t>
+        <w:t>Sequence/Activity: Hình 3.3, 3.4, 3.6–3.10; tổng cộng 7 sơ đồ quy trình</w:t>
+      </w:r>
+    </w:p>
+    <w:p>
+      <w:pPr>
+        <w:pStyle w:val="ListBullet"/>
+        <w:ind w:left="397"/>
+      </w:pPr>
+      <w:r>
+        <w:t>Vòng đời booking: Hình 3.5</w:t>
       </w:r>
     </w:p>
     <w:p>
@@ -3413,7 +3723,7 @@
         <w:ind w:left="397"/>
       </w:pPr>
       <w:r>
-        <w:t>Flow of Work: Phụ lục C</w:t>
+        <w:t>Flow of Work: Hình C.1, Phụ lục C</w:t>
       </w:r>
     </w:p>
     <w:p>
@@ -3443,64 +3753,11 @@
     </w:p>
     <w:p>
       <w:pPr>
-        <w:jc w:val="both"/>
-      </w:pPr>
-      <w:r>
-        <w:t>Quy trình đề xuất khi bảo vệ: yêu cầu → Stories → model/UML → chia tác vụ → repository/UI → review/test → build → ảnh minh chứng → giới hạn. README có danh sách ba người nhưng không phân công; nhóm cần điền theo thực tế, không suy đoán từ tác giả commit.</w:t>
-      </w:r>
-    </w:p>
-    <w:p>
-      <w:r>
-        <w:br w:type="page"/>
-      </w:r>
-    </w:p>
-    <w:p>
-      <w:pPr>
-        <w:keepNext/>
-        <w:spacing w:before="80" w:after="100"/>
-        <w:jc w:val="left"/>
-      </w:pPr>
-      <w:r>
-        <w:rPr>
-          <w:rFonts w:ascii="Times New Roman" w:hAnsi="Times New Roman"/>
-          <w:b/>
-          <w:color w:val="000000"/>
-          <w:sz w:val="24"/>
-        </w:rPr>
-        <w:t>PHỤ LỤC D. Thuật ngữ</w:t>
-      </w:r>
-    </w:p>
-    <w:p>
-      <w:pPr>
-        <w:jc w:val="both"/>
-      </w:pPr>
-      <w:r>
-        <w:t>Homestay: nơi nghỉ; Room: phòng; Booking: yêu cầu lưu trú; ADR/RevPAR: chỉ số phòng khi đủ dữ liệu; Local demo: dữ liệu trên thiết bị; Prototype: bản thử ý tưởng và luồng.</w:t>
-      </w:r>
-    </w:p>
-    <w:p>
-      <w:pPr>
-        <w:keepNext/>
-        <w:spacing w:before="80" w:after="100"/>
-        <w:jc w:val="left"/>
-      </w:pPr>
-      <w:r>
-        <w:rPr>
-          <w:rFonts w:ascii="Times New Roman" w:hAnsi="Times New Roman"/>
-          <w:b/>
-          <w:color w:val="000000"/>
-          <w:sz w:val="24"/>
-        </w:rPr>
-        <w:t>PHỤ LỤC E.1 Activity tìm kiếm</w:t>
-      </w:r>
-    </w:p>
-    <w:p>
-      <w:pPr>
         <w:keepNext/>
         <w:jc w:val="both"/>
       </w:pPr>
       <w:r>
-        <w:t>Khách nhập địa điểm và điều kiện lưu trú, áp dụng bộ lọc rồi kiểm tra kết quả. Khi không có kết quả, ứng dụng cần cho phép điều chỉnh điều kiện thay vì để người dùng ở trạng thái cụt.</w:t>
+        <w:t>Nhóm bắt đầu từ yêu cầu và User Stories, phân tích tác nhân/quy tắc, dựng model cùng UML, thiết kế màn hình, triển khai UI và repository, rồi kiểm thử, build và chụp minh chứng. Kết quả kiểm thử quay lại backlog để sửa. Hình C.1 thể hiện vòng công việc đã áp dụng cho prototype.</w:t>
       </w:r>
     </w:p>
     <w:p>
@@ -3520,7 +3777,7 @@
               <a:graphicData uri="http://schemas.openxmlformats.org/drawingml/2006/picture">
                 <pic:pic>
                   <pic:nvPicPr>
-                    <pic:cNvPr id="0" name="activity_search.png"/>
+                    <pic:cNvPr id="0" name="workflow.png"/>
                     <pic:cNvPicPr/>
                   </pic:nvPicPr>
                   <pic:blipFill>
@@ -3553,7 +3810,7 @@
           <w:i/>
           <w:sz w:val="20"/>
         </w:rPr>
-        <w:t>Hình 3.6. Sơ đồ hoạt động tìm kiếm và lọc.</w:t>
+        <w:t>Hình C.1. Quy trình thực hiện và kiểm tra HHL Stay.</w:t>
       </w:r>
     </w:p>
     <w:p>
@@ -3569,16 +3826,40 @@
           <w:color w:val="000000"/>
           <w:sz w:val="24"/>
         </w:rPr>
-        <w:t>PHỤ LỤC E.2 Activity nhận và trả phòng</w:t>
+        <w:t>PHỤ LỤC D. Thuật ngữ</w:t>
       </w:r>
     </w:p>
     <w:p>
       <w:pPr>
+        <w:jc w:val="both"/>
+      </w:pPr>
+      <w:r>
+        <w:t>Homestay: nơi nghỉ; Room: phòng; Booking: yêu cầu lưu trú; ADR/RevPAR: chỉ số phòng khi đủ dữ liệu; Local demo: dữ liệu trên thiết bị; Prototype: bản thử ý tưởng và luồng.</w:t>
+      </w:r>
+    </w:p>
+    <w:p>
+      <w:pPr>
+        <w:keepNext/>
+        <w:spacing w:before="80" w:after="100"/>
+        <w:jc w:val="left"/>
+      </w:pPr>
+      <w:r>
+        <w:rPr>
+          <w:rFonts w:ascii="Times New Roman" w:hAnsi="Times New Roman"/>
+          <w:b/>
+          <w:color w:val="000000"/>
+          <w:sz w:val="24"/>
+        </w:rPr>
+        <w:t>PHỤ LỤC E.1 Activity tìm kiếm</w:t>
+      </w:r>
+    </w:p>
+    <w:p>
+      <w:pPr>
         <w:keepNext/>
         <w:jc w:val="both"/>
       </w:pPr>
       <w:r>
-        <w:t>Quản trị tìm booking, xác minh mã và ngày lưu trú, rồi ghi nhận check-in/check-out. Bản demo chỉ kiểm tra nội bộ; hệ thống thật cần server xác minh và nhật ký thao tác.</w:t>
+        <w:t>Khách nhập địa điểm và điều kiện lưu trú, áp dụng bộ lọc rồi kiểm tra kết quả. Khi không có kết quả, ứng dụng cần cho phép điều chỉnh điều kiện thay vì để người dùng ở trạng thái cụt.</w:t>
       </w:r>
     </w:p>
     <w:p>
@@ -3598,7 +3879,7 @@
               <a:graphicData uri="http://schemas.openxmlformats.org/drawingml/2006/picture">
                 <pic:pic>
                   <pic:nvPicPr>
-                    <pic:cNvPr id="0" name="activity_checkin.png"/>
+                    <pic:cNvPr id="0" name="activity_search.png"/>
                     <pic:cNvPicPr/>
                   </pic:nvPicPr>
                   <pic:blipFill>
@@ -3631,7 +3912,7 @@
           <w:i/>
           <w:sz w:val="20"/>
         </w:rPr>
-        <w:t>Hình 3.7. Sơ đồ hoạt động nhận và trả phòng.</w:t>
+        <w:t>Hình 3.6. Sơ đồ hoạt động tìm kiếm và lọc.</w:t>
       </w:r>
     </w:p>
     <w:p>
@@ -3647,7 +3928,7 @@
           <w:color w:val="000000"/>
           <w:sz w:val="24"/>
         </w:rPr>
-        <w:t>PHỤ LỤC E.3 Sequence duyệt booking</w:t>
+        <w:t>PHỤ LỤC E.2 Activity nhận và trả phòng</w:t>
       </w:r>
     </w:p>
     <w:p>
@@ -3656,7 +3937,7 @@
         <w:jc w:val="both"/>
       </w:pPr>
       <w:r>
-        <w:t>Host chọn hành động trên giao diện; provider gọi repository; repository kiểm tra điều kiện rồi cập nhật storage local. Kết quả được phản hồi lại để danh sách và dashboard dựng lại.</w:t>
+        <w:t>Quản trị tìm booking, xác minh mã và ngày lưu trú, rồi ghi nhận check-in/check-out. Bản demo chỉ kiểm tra nội bộ; hệ thống thật cần server xác minh và nhật ký thao tác.</w:t>
       </w:r>
     </w:p>
     <w:p>
@@ -3676,7 +3957,7 @@
               <a:graphicData uri="http://schemas.openxmlformats.org/drawingml/2006/picture">
                 <pic:pic>
                   <pic:nvPicPr>
-                    <pic:cNvPr id="0" name="sequence_approval.png"/>
+                    <pic:cNvPr id="0" name="activity_checkin.png"/>
                     <pic:cNvPicPr/>
                   </pic:nvPicPr>
                   <pic:blipFill>
@@ -3709,7 +3990,7 @@
           <w:i/>
           <w:sz w:val="20"/>
         </w:rPr>
-        <w:t>Hình 3.8. Sơ đồ tuần tự duyệt booking.</w:t>
+        <w:t>Hình 3.7. Sơ đồ hoạt động nhận và trả phòng.</w:t>
       </w:r>
     </w:p>
     <w:p>
@@ -3725,7 +4006,7 @@
           <w:color w:val="000000"/>
           <w:sz w:val="24"/>
         </w:rPr>
-        <w:t>PHỤ LỤC E.4 Sequence đánh giá</w:t>
+        <w:t>PHỤ LỤC E.3 Sequence duyệt booking</w:t>
       </w:r>
     </w:p>
     <w:p>
@@ -3734,7 +4015,7 @@
         <w:jc w:val="both"/>
       </w:pPr>
       <w:r>
-        <w:t>Khách gửi điểm và nhận xét; hệ thống kiểm tra booking đã hoàn tất, lưu review và cập nhật danh sách/điểm trung bình. Ràng buộc chủ đơn phải được kiểm tra lại ở server khi có backend.</w:t>
+        <w:t>Host chọn hành động trên giao diện; provider gọi repository; repository kiểm tra điều kiện rồi cập nhật storage local. Kết quả được phản hồi lại để danh sách và dashboard dựng lại.</w:t>
       </w:r>
     </w:p>
     <w:p>
@@ -3754,7 +4035,7 @@
               <a:graphicData uri="http://schemas.openxmlformats.org/drawingml/2006/picture">
                 <pic:pic>
                   <pic:nvPicPr>
-                    <pic:cNvPr id="0" name="sequence_review.png"/>
+                    <pic:cNvPr id="0" name="sequence_approval.png"/>
                     <pic:cNvPicPr/>
                   </pic:nvPicPr>
                   <pic:blipFill>
@@ -3787,7 +4068,7 @@
           <w:i/>
           <w:sz w:val="20"/>
         </w:rPr>
-        <w:t>Hình 3.9. Sơ đồ tuần tự gửi đánh giá.</w:t>
+        <w:t>Hình 3.8. Sơ đồ tuần tự duyệt booking.</w:t>
       </w:r>
     </w:p>
     <w:p>
@@ -3803,7 +4084,7 @@
           <w:color w:val="000000"/>
           <w:sz w:val="24"/>
         </w:rPr>
-        <w:t>PHỤ LỤC E.5 Sequence báo cáo tài chính</w:t>
+        <w:t>PHỤ LỤC E.4 Sequence đánh giá</w:t>
       </w:r>
     </w:p>
     <w:p>
@@ -3812,7 +4093,7 @@
         <w:jc w:val="both"/>
       </w:pPr>
       <w:r>
-        <w:t>Quản trị chọn kỳ; repository đọc booking và expense demo, tổng hợp chỉ số rồi trả cho UI hiển thị KPI/biểu đồ. Chỉ số phụ thuộc dữ liệu local và định nghĩa kỳ.</w:t>
+        <w:t>Khách gửi điểm và nhận xét; hệ thống kiểm tra booking đã hoàn tất, lưu review và cập nhật danh sách/điểm trung bình. Ràng buộc chủ đơn phải được kiểm tra lại ở server khi có backend.</w:t>
       </w:r>
     </w:p>
     <w:p>
@@ -3832,11 +4113,89 @@
               <a:graphicData uri="http://schemas.openxmlformats.org/drawingml/2006/picture">
                 <pic:pic>
                   <pic:nvPicPr>
+                    <pic:cNvPr id="0" name="sequence_review.png"/>
+                    <pic:cNvPicPr/>
+                  </pic:nvPicPr>
+                  <pic:blipFill>
+                    <a:blip r:embed="rId22"/>
+                    <a:stretch>
+                      <a:fillRect/>
+                    </a:stretch>
+                  </pic:blipFill>
+                  <pic:spPr>
+                    <a:xfrm>
+                      <a:off x="0" y="0"/>
+                      <a:ext cx="5076000" cy="2755543"/>
+                    </a:xfrm>
+                    <a:prstGeom prst="rect"/>
+                  </pic:spPr>
+                </pic:pic>
+              </a:graphicData>
+            </a:graphic>
+          </wp:inline>
+        </w:drawing>
+      </w:r>
+    </w:p>
+    <w:p>
+      <w:pPr>
+        <w:keepLines/>
+        <w:jc w:val="center"/>
+      </w:pPr>
+      <w:r>
+        <w:rPr>
+          <w:i/>
+          <w:sz w:val="20"/>
+        </w:rPr>
+        <w:t>Hình 3.9. Sơ đồ tuần tự gửi đánh giá.</w:t>
+      </w:r>
+    </w:p>
+    <w:p>
+      <w:pPr>
+        <w:keepNext/>
+        <w:spacing w:before="80" w:after="100"/>
+        <w:jc w:val="left"/>
+      </w:pPr>
+      <w:r>
+        <w:rPr>
+          <w:rFonts w:ascii="Times New Roman" w:hAnsi="Times New Roman"/>
+          <w:b/>
+          <w:color w:val="000000"/>
+          <w:sz w:val="24"/>
+        </w:rPr>
+        <w:t>PHỤ LỤC E.5 Sequence báo cáo tài chính</w:t>
+      </w:r>
+    </w:p>
+    <w:p>
+      <w:pPr>
+        <w:keepNext/>
+        <w:jc w:val="both"/>
+      </w:pPr>
+      <w:r>
+        <w:t>Quản trị chọn kỳ; repository đọc booking và expense demo, tổng hợp chỉ số rồi trả cho UI hiển thị KPI/biểu đồ. Chỉ số phụ thuộc dữ liệu local và định nghĩa kỳ.</w:t>
+      </w:r>
+    </w:p>
+    <w:p>
+      <w:pPr>
+        <w:keepNext/>
+        <w:jc w:val="center"/>
+      </w:pPr>
+      <w:r>
+        <w:drawing>
+          <wp:inline xmlns:a="http://schemas.openxmlformats.org/drawingml/2006/main" xmlns:pic="http://schemas.openxmlformats.org/drawingml/2006/picture">
+            <wp:extent cx="5076000" cy="2755543"/>
+            <wp:docPr id="12" name="Picture 12"/>
+            <wp:cNvGraphicFramePr>
+              <a:graphicFrameLocks noChangeAspect="1"/>
+            </wp:cNvGraphicFramePr>
+            <a:graphic>
+              <a:graphicData uri="http://schemas.openxmlformats.org/drawingml/2006/picture">
+                <pic:pic>
+                  <pic:nvPicPr>
                     <pic:cNvPr id="0" name="sequence_finance.png"/>
                     <pic:cNvPicPr/>
                   </pic:nvPicPr>
                   <pic:blipFill>
-                    <a:blip r:embed="rId22"/>
+                    <a:blip r:embed="rId23"/>
                     <a:stretch>
                       <a:fillRect/>
                     </a:stretch>
@@ -16803,7 +17162,7 @@
         <w:drawing>
           <wp:inline xmlns:a="http://schemas.openxmlformats.org/drawingml/2006/main" xmlns:pic="http://schemas.openxmlformats.org/drawingml/2006/picture">
             <wp:extent cx="5112000" cy="2875500"/>
-            <wp:docPr id="12" name="Picture 12"/>
+            <wp:docPr id="13" name="Picture 13"/>
             <wp:cNvGraphicFramePr>
               <a:graphicFrameLocks noChangeAspect="1"/>
             </wp:cNvGraphicFramePr>
@@ -16812,53 +17171,6 @@
                 <pic:pic>
                   <pic:nvPicPr>
                     <pic:cNvPr id="0" name="01-home.jpg"/>
-                    <pic:cNvPicPr/>
-                  </pic:nvPicPr>
-                  <pic:blipFill>
-                    <a:blip r:embed="rId23"/>
-                    <a:stretch>
-                      <a:fillRect/>
-                    </a:stretch>
-                  </pic:blipFill>
-                  <pic:spPr>
-                    <a:xfrm>
-                      <a:off x="0" y="0"/>
-                      <a:ext cx="5112000" cy="2875500"/>
-                    </a:xfrm>
-                    <a:prstGeom prst="rect"/>
-                  </pic:spPr>
-                </pic:pic>
-              </a:graphicData>
-            </a:graphic>
-          </wp:inline>
-        </w:drawing>
-      </w:r>
-    </w:p>
-    <w:p>
-      <w:pPr>
-        <w:jc w:val="center"/>
-      </w:pPr>
-      <w:r>
-        <w:t>Trang Home — localhost:8083</w:t>
-      </w:r>
-    </w:p>
-    <w:p>
-      <w:pPr>
-        <w:jc w:val="center"/>
-      </w:pPr>
-      <w:r>
-        <w:drawing>
-          <wp:inline xmlns:a="http://schemas.openxmlformats.org/drawingml/2006/main" xmlns:pic="http://schemas.openxmlformats.org/drawingml/2006/picture">
-            <wp:extent cx="5112000" cy="2875500"/>
-            <wp:docPr id="13" name="Picture 13"/>
-            <wp:cNvGraphicFramePr>
-              <a:graphicFrameLocks noChangeAspect="1"/>
-            </wp:cNvGraphicFramePr>
-            <a:graphic>
-              <a:graphicData uri="http://schemas.openxmlformats.org/drawingml/2006/picture">
-                <pic:pic>
-                  <pic:nvPicPr>
-                    <pic:cNvPr id="0" name="02-explore.jpg"/>
                     <pic:cNvPicPr/>
                   </pic:nvPicPr>
                   <pic:blipFill>
@@ -16886,20 +17198,7 @@
         <w:jc w:val="center"/>
       </w:pPr>
       <w:r>
-        <w:t>Trang Khám phá — localhost:8083</w:t>
-      </w:r>
-    </w:p>
-    <w:p>
-      <w:r>
-        <w:br w:type="page"/>
-      </w:r>
-    </w:p>
-    <w:p>
-      <w:pPr>
-        <w:pStyle w:val="Heading1"/>
-      </w:pPr>
-      <w:r>
-        <w:t>PHỤ LỤC G. ẢNH CHỤP GIAO DIỆN 03–04</w:t>
+        <w:t>Trang Home — localhost:8083</w:t>
       </w:r>
     </w:p>
     <w:p>
@@ -16918,7 +17217,7 @@
               <a:graphicData uri="http://schemas.openxmlformats.org/drawingml/2006/picture">
                 <pic:pic>
                   <pic:nvPicPr>
-                    <pic:cNvPr id="0" name="03-detail.jpg"/>
+                    <pic:cNvPr id="0" name="02-explore.jpg"/>
                     <pic:cNvPicPr/>
                   </pic:nvPicPr>
                   <pic:blipFill>
@@ -16946,7 +17245,20 @@
         <w:jc w:val="center"/>
       </w:pPr>
       <w:r>
-        <w:t>Chi tiết homestay — localhost:8083</w:t>
+        <w:t>Trang Khám phá — localhost:8083</w:t>
+      </w:r>
+    </w:p>
+    <w:p>
+      <w:r>
+        <w:br w:type="page"/>
+      </w:r>
+    </w:p>
+    <w:p>
+      <w:pPr>
+        <w:pStyle w:val="Heading1"/>
+      </w:pPr>
+      <w:r>
+        <w:t>PHỤ LỤC G. ẢNH CHỤP GIAO DIỆN 03–04</w:t>
       </w:r>
     </w:p>
     <w:p>
@@ -16965,7 +17277,7 @@
               <a:graphicData uri="http://schemas.openxmlformats.org/drawingml/2006/picture">
                 <pic:pic>
                   <pic:nvPicPr>
-                    <pic:cNvPr id="0" name="04-booking.jpg"/>
+                    <pic:cNvPr id="0" name="03-detail.jpg"/>
                     <pic:cNvPicPr/>
                   </pic:nvPicPr>
                   <pic:blipFill>
@@ -16993,20 +17305,7 @@
         <w:jc w:val="center"/>
       </w:pPr>
       <w:r>
-        <w:t>Form đặt phòng — localhost:8083</w:t>
-      </w:r>
-    </w:p>
-    <w:p>
-      <w:r>
-        <w:br w:type="page"/>
-      </w:r>
-    </w:p>
-    <w:p>
-      <w:pPr>
-        <w:pStyle w:val="Heading1"/>
-      </w:pPr>
-      <w:r>
-        <w:t>PHỤ LỤC G. ẢNH CHỤP GIAO DIỆN 05–06</w:t>
+        <w:t>Chi tiết homestay — localhost:8083</w:t>
       </w:r>
     </w:p>
     <w:p>
@@ -17025,7 +17324,7 @@
               <a:graphicData uri="http://schemas.openxmlformats.org/drawingml/2006/picture">
                 <pic:pic>
                   <pic:nvPicPr>
-                    <pic:cNvPr id="0" name="05-bookings.jpg"/>
+                    <pic:cNvPr id="0" name="04-booking.jpg"/>
                     <pic:cNvPicPr/>
                   </pic:nvPicPr>
                   <pic:blipFill>
@@ -17053,7 +17352,20 @@
         <w:jc w:val="center"/>
       </w:pPr>
       <w:r>
-        <w:t>Lịch sử đặt phòng khách — localhost:8083</w:t>
+        <w:t>Form đặt phòng — localhost:8083</w:t>
+      </w:r>
+    </w:p>
+    <w:p>
+      <w:r>
+        <w:br w:type="page"/>
+      </w:r>
+    </w:p>
+    <w:p>
+      <w:pPr>
+        <w:pStyle w:val="Heading1"/>
+      </w:pPr>
+      <w:r>
+        <w:t>PHỤ LỤC G. ẢNH CHỤP GIAO DIỆN 05–06</w:t>
       </w:r>
     </w:p>
     <w:p>
@@ -17072,7 +17384,7 @@
               <a:graphicData uri="http://schemas.openxmlformats.org/drawingml/2006/picture">
                 <pic:pic>
                   <pic:nvPicPr>
-                    <pic:cNvPr id="0" name="06-favorites.jpg"/>
+                    <pic:cNvPr id="0" name="05-bookings.jpg"/>
                     <pic:cNvPicPr/>
                   </pic:nvPicPr>
                   <pic:blipFill>
@@ -17100,20 +17412,7 @@
         <w:jc w:val="center"/>
       </w:pPr>
       <w:r>
-        <w:t>Danh sách yêu thích — localhost:8083</w:t>
-      </w:r>
-    </w:p>
-    <w:p>
-      <w:r>
-        <w:br w:type="page"/>
-      </w:r>
-    </w:p>
-    <w:p>
-      <w:pPr>
-        <w:pStyle w:val="Heading1"/>
-      </w:pPr>
-      <w:r>
-        <w:t>PHỤ LỤC G. ẢNH CHỤP GIAO DIỆN 07–08</w:t>
+        <w:t>Lịch sử đặt phòng khách — localhost:8083</w:t>
       </w:r>
     </w:p>
     <w:p>
@@ -17132,7 +17431,7 @@
               <a:graphicData uri="http://schemas.openxmlformats.org/drawingml/2006/picture">
                 <pic:pic>
                   <pic:nvPicPr>
-                    <pic:cNvPr id="0" name="07-login.jpg"/>
+                    <pic:cNvPr id="0" name="06-favorites.jpg"/>
                     <pic:cNvPicPr/>
                   </pic:nvPicPr>
                   <pic:blipFill>
@@ -17160,7 +17459,20 @@
         <w:jc w:val="center"/>
       </w:pPr>
       <w:r>
-        <w:t>Đăng nhập khách — localhost:8083</w:t>
+        <w:t>Danh sách yêu thích — localhost:8083</w:t>
+      </w:r>
+    </w:p>
+    <w:p>
+      <w:r>
+        <w:br w:type="page"/>
+      </w:r>
+    </w:p>
+    <w:p>
+      <w:pPr>
+        <w:pStyle w:val="Heading1"/>
+      </w:pPr>
+      <w:r>
+        <w:t>PHỤ LỤC G. ẢNH CHỤP GIAO DIỆN 07–08</w:t>
       </w:r>
     </w:p>
     <w:p>
@@ -17179,7 +17491,7 @@
               <a:graphicData uri="http://schemas.openxmlformats.org/drawingml/2006/picture">
                 <pic:pic>
                   <pic:nvPicPr>
-                    <pic:cNvPr id="0" name="08-register.jpg"/>
+                    <pic:cNvPr id="0" name="07-login.jpg"/>
                     <pic:cNvPicPr/>
                   </pic:nvPicPr>
                   <pic:blipFill>
@@ -17207,20 +17519,7 @@
         <w:jc w:val="center"/>
       </w:pPr>
       <w:r>
-        <w:t>Đăng ký tài khoản — localhost:8083</w:t>
-      </w:r>
-    </w:p>
-    <w:p>
-      <w:r>
-        <w:br w:type="page"/>
-      </w:r>
-    </w:p>
-    <w:p>
-      <w:pPr>
-        <w:pStyle w:val="Heading1"/>
-      </w:pPr>
-      <w:r>
-        <w:t>PHỤ LỤC G. ẢNH CHỤP GIAO DIỆN 09–10</w:t>
+        <w:t>Đăng nhập khách — localhost:8083</w:t>
       </w:r>
     </w:p>
     <w:p>
@@ -17239,7 +17538,7 @@
               <a:graphicData uri="http://schemas.openxmlformats.org/drawingml/2006/picture">
                 <pic:pic>
                   <pic:nvPicPr>
-                    <pic:cNvPr id="0" name="09-profile.jpg"/>
+                    <pic:cNvPr id="0" name="08-register.jpg"/>
                     <pic:cNvPicPr/>
                   </pic:nvPicPr>
                   <pic:blipFill>
@@ -17267,7 +17566,20 @@
         <w:jc w:val="center"/>
       </w:pPr>
       <w:r>
-        <w:t>Hồ sơ khách — localhost:8083</w:t>
+        <w:t>Đăng ký tài khoản — localhost:8083</w:t>
+      </w:r>
+    </w:p>
+    <w:p>
+      <w:r>
+        <w:br w:type="page"/>
+      </w:r>
+    </w:p>
+    <w:p>
+      <w:pPr>
+        <w:pStyle w:val="Heading1"/>
+      </w:pPr>
+      <w:r>
+        <w:t>PHỤ LỤC G. ẢNH CHỤP GIAO DIỆN 09–10</w:t>
       </w:r>
     </w:p>
     <w:p>
@@ -17286,7 +17598,7 @@
               <a:graphicData uri="http://schemas.openxmlformats.org/drawingml/2006/picture">
                 <pic:pic>
                   <pic:nvPicPr>
-                    <pic:cNvPr id="0" name="10-admin-dashboard.jpg"/>
+                    <pic:cNvPr id="0" name="09-profile.jpg"/>
                     <pic:cNvPicPr/>
                   </pic:nvPicPr>
                   <pic:blipFill>
@@ -17314,20 +17626,7 @@
         <w:jc w:val="center"/>
       </w:pPr>
       <w:r>
-        <w:t>Tổng quan quản trị — localhost:8083</w:t>
-      </w:r>
-    </w:p>
-    <w:p>
-      <w:r>
-        <w:br w:type="page"/>
-      </w:r>
-    </w:p>
-    <w:p>
-      <w:pPr>
-        <w:pStyle w:val="Heading1"/>
-      </w:pPr>
-      <w:r>
-        <w:t>PHỤ LỤC G. ẢNH CHỤP GIAO DIỆN 11–12</w:t>
+        <w:t>Hồ sơ khách — localhost:8083</w:t>
       </w:r>
     </w:p>
     <w:p>
@@ -17346,7 +17645,7 @@
               <a:graphicData uri="http://schemas.openxmlformats.org/drawingml/2006/picture">
                 <pic:pic>
                   <pic:nvPicPr>
-                    <pic:cNvPr id="0" name="11-admin-finance.jpg"/>
+                    <pic:cNvPr id="0" name="10-admin-dashboard.jpg"/>
                     <pic:cNvPicPr/>
                   </pic:nvPicPr>
                   <pic:blipFill>
@@ -17374,7 +17673,20 @@
         <w:jc w:val="center"/>
       </w:pPr>
       <w:r>
-        <w:t>Quản lý tài chính — localhost:8083</w:t>
+        <w:t>Tổng quan quản trị — localhost:8083</w:t>
+      </w:r>
+    </w:p>
+    <w:p>
+      <w:r>
+        <w:br w:type="page"/>
+      </w:r>
+    </w:p>
+    <w:p>
+      <w:pPr>
+        <w:pStyle w:val="Heading1"/>
+      </w:pPr>
+      <w:r>
+        <w:t>PHỤ LỤC G. ẢNH CHỤP GIAO DIỆN 11–12</w:t>
       </w:r>
     </w:p>
     <w:p>
@@ -17393,7 +17705,7 @@
               <a:graphicData uri="http://schemas.openxmlformats.org/drawingml/2006/picture">
                 <pic:pic>
                   <pic:nvPicPr>
-                    <pic:cNvPr id="0" name="12-admin-calendar.jpg"/>
+                    <pic:cNvPr id="0" name="11-admin-finance.jpg"/>
                     <pic:cNvPicPr/>
                   </pic:nvPicPr>
                   <pic:blipFill>
@@ -17421,20 +17733,7 @@
         <w:jc w:val="center"/>
       </w:pPr>
       <w:r>
-        <w:t>Lịch phòng — localhost:8083</w:t>
-      </w:r>
-    </w:p>
-    <w:p>
-      <w:r>
-        <w:br w:type="page"/>
-      </w:r>
-    </w:p>
-    <w:p>
-      <w:pPr>
-        <w:pStyle w:val="Heading1"/>
-      </w:pPr>
-      <w:r>
-        <w:t>PHỤ LỤC G. ẢNH CHỤP GIAO DIỆN 13–14</w:t>
+        <w:t>Quản lý tài chính — localhost:8083</w:t>
       </w:r>
     </w:p>
     <w:p>
@@ -17453,7 +17752,7 @@
               <a:graphicData uri="http://schemas.openxmlformats.org/drawingml/2006/picture">
                 <pic:pic>
                   <pic:nvPicPr>
-                    <pic:cNvPr id="0" name="13-admin-housekeeping.jpg"/>
+                    <pic:cNvPr id="0" name="12-admin-calendar.jpg"/>
                     <pic:cNvPicPr/>
                   </pic:nvPicPr>
                   <pic:blipFill>
@@ -17481,7 +17780,20 @@
         <w:jc w:val="center"/>
       </w:pPr>
       <w:r>
-        <w:t>Quản lý buồng phòng — localhost:8083</w:t>
+        <w:t>Lịch phòng — localhost:8083</w:t>
+      </w:r>
+    </w:p>
+    <w:p>
+      <w:r>
+        <w:br w:type="page"/>
+      </w:r>
+    </w:p>
+    <w:p>
+      <w:pPr>
+        <w:pStyle w:val="Heading1"/>
+      </w:pPr>
+      <w:r>
+        <w:t>PHỤ LỤC G. ẢNH CHỤP GIAO DIỆN 13–14</w:t>
       </w:r>
     </w:p>
     <w:p>
@@ -17500,11 +17812,58 @@
               <a:graphicData uri="http://schemas.openxmlformats.org/drawingml/2006/picture">
                 <pic:pic>
                   <pic:nvPicPr>
+                    <pic:cNvPr id="0" name="13-admin-housekeeping.jpg"/>
+                    <pic:cNvPicPr/>
+                  </pic:nvPicPr>
+                  <pic:blipFill>
+                    <a:blip r:embed="rId36"/>
+                    <a:stretch>
+                      <a:fillRect/>
+                    </a:stretch>
+                  </pic:blipFill>
+                  <pic:spPr>
+                    <a:xfrm>
+                      <a:off x="0" y="0"/>
+                      <a:ext cx="5112000" cy="2875500"/>
+                    </a:xfrm>
+                    <a:prstGeom prst="rect"/>
+                  </pic:spPr>
+                </pic:pic>
+              </a:graphicData>
+            </a:graphic>
+          </wp:inline>
+        </w:drawing>
+      </w:r>
+    </w:p>
+    <w:p>
+      <w:pPr>
+        <w:jc w:val="center"/>
+      </w:pPr>
+      <w:r>
+        <w:t>Quản lý buồng phòng — localhost:8083</w:t>
+      </w:r>
+    </w:p>
+    <w:p>
+      <w:pPr>
+        <w:jc w:val="center"/>
+      </w:pPr>
+      <w:r>
+        <w:drawing>
+          <wp:inline xmlns:a="http://schemas.openxmlformats.org/drawingml/2006/main" xmlns:pic="http://schemas.openxmlformats.org/drawingml/2006/picture">
+            <wp:extent cx="5112000" cy="2875500"/>
+            <wp:docPr id="26" name="Picture 26"/>
+            <wp:cNvGraphicFramePr>
+              <a:graphicFrameLocks noChangeAspect="1"/>
+            </wp:cNvGraphicFramePr>
+            <a:graphic>
+              <a:graphicData uri="http://schemas.openxmlformats.org/drawingml/2006/picture">
+                <pic:pic>
+                  <pic:nvPicPr>
                     <pic:cNvPr id="0" name="14-ai-assistant.jpg"/>
                     <pic:cNvPicPr/>
                   </pic:nvPicPr>
                   <pic:blipFill>
-                    <a:blip r:embed="rId36"/>
+                    <a:blip r:embed="rId37"/>
                     <a:stretch>
                       <a:fillRect/>
                     </a:stretch>

</xml_diff>